<commit_message>
Before implementing own pipeline
</commit_message>
<xml_diff>
--- a/EDA/Summary_of_results.docx
+++ b/EDA/Summary_of_results.docx
@@ -247,9 +247,24 @@
         <w:t xml:space="preserve">Widespread success rate across many top industries. </w:t>
       </w:r>
       <w:r>
+        <w:rPr>
+          <w:b/>
+          <w:bCs/>
+        </w:rPr>
         <w:t>Would be interesting to scrape growth rate of top-N industries to try and normalise/explain this trend</w:t>
       </w:r>
       <w:r>
+        <w:rPr>
+          <w:b/>
+          <w:bCs/>
+        </w:rPr>
+        <w:t xml:space="preserve"> – out of scope though</w:t>
+      </w:r>
+      <w:r>
+        <w:rPr>
+          <w:b/>
+          <w:bCs/>
+        </w:rPr>
         <w:t>:</w:t>
       </w:r>
     </w:p>
@@ -488,6 +503,80 @@
       </w:r>
     </w:p>
     <w:p>
+      <w:r>
+        <w:rPr>
+          <w:noProof/>
+        </w:rPr>
+        <mc:AlternateContent>
+          <mc:Choice Requires="wps">
+            <w:drawing>
+              <wp:anchor distT="0" distB="0" distL="114300" distR="114300" simplePos="0" relativeHeight="251659264" behindDoc="0" locked="0" layoutInCell="1" allowOverlap="1" wp14:anchorId="1FFC5289" wp14:editId="5F30AFD4">
+                <wp:simplePos x="0" y="0"/>
+                <wp:positionH relativeFrom="column">
+                  <wp:posOffset>2784764</wp:posOffset>
+                </wp:positionH>
+                <wp:positionV relativeFrom="paragraph">
+                  <wp:posOffset>268432</wp:posOffset>
+                </wp:positionV>
+                <wp:extent cx="1032163" cy="2673927"/>
+                <wp:effectExtent l="0" t="0" r="0" b="0"/>
+                <wp:wrapNone/>
+                <wp:docPr id="1864521558" name="Multiplication Sign 1"/>
+                <wp:cNvGraphicFramePr/>
+                <a:graphic xmlns:a="http://schemas.openxmlformats.org/drawingml/2006/main">
+                  <a:graphicData uri="http://schemas.microsoft.com/office/word/2010/wordprocessingShape">
+                    <wps:wsp>
+                      <wps:cNvSpPr/>
+                      <wps:spPr>
+                        <a:xfrm>
+                          <a:off x="0" y="0"/>
+                          <a:ext cx="1032163" cy="2673927"/>
+                        </a:xfrm>
+                        <a:prstGeom prst="mathMultiply">
+                          <a:avLst/>
+                        </a:prstGeom>
+                        <a:solidFill>
+                          <a:srgbClr val="EE0000"/>
+                        </a:solidFill>
+                      </wps:spPr>
+                      <wps:style>
+                        <a:lnRef idx="2">
+                          <a:schemeClr val="accent1">
+                            <a:shade val="15000"/>
+                          </a:schemeClr>
+                        </a:lnRef>
+                        <a:fillRef idx="1">
+                          <a:schemeClr val="accent1"/>
+                        </a:fillRef>
+                        <a:effectRef idx="0">
+                          <a:schemeClr val="accent1"/>
+                        </a:effectRef>
+                        <a:fontRef idx="minor">
+                          <a:schemeClr val="lt1"/>
+                        </a:fontRef>
+                      </wps:style>
+                      <wps:bodyPr rot="0" spcFirstLastPara="0" vertOverflow="overflow" horzOverflow="overflow" vert="horz" wrap="square" lIns="91440" tIns="45720" rIns="91440" bIns="45720" numCol="1" spcCol="0" rtlCol="0" fromWordArt="0" anchor="ctr" anchorCtr="0" forceAA="0" compatLnSpc="1">
+                        <a:prstTxWarp prst="textNoShape">
+                          <a:avLst/>
+                        </a:prstTxWarp>
+                        <a:noAutofit/>
+                      </wps:bodyPr>
+                    </wps:wsp>
+                  </a:graphicData>
+                </a:graphic>
+              </wp:anchor>
+            </w:drawing>
+          </mc:Choice>
+          <mc:Fallback>
+            <w:pict>
+              <v:shape w14:anchorId="14BC653C" id="Multiplication Sign 1" o:spid="_x0000_s1026" style="position:absolute;margin-left:219.25pt;margin-top:21.15pt;width:81.25pt;height:210.55pt;z-index:251659264;visibility:visible;mso-wrap-style:square;mso-wrap-distance-left:9pt;mso-wrap-distance-top:0;mso-wrap-distance-right:9pt;mso-wrap-distance-bottom:0;mso-position-horizontal:absolute;mso-position-horizontal-relative:text;mso-position-vertical:absolute;mso-position-vertical-relative:text;v-text-anchor:middle" coordsize="1032163,2673927" o:gfxdata="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" path="m134661,685922l361138,598499,516082,999895,671025,598499r226477,87423l646193,1336964r251309,651041l671025,2075428,516082,1674032,361138,2075428,134661,1988005,385970,1336964,134661,685922xe" fillcolor="#e00" strokecolor="#030e13 [484]" strokeweight="1pt">
+                <v:stroke joinstyle="miter"/>
+                <v:path arrowok="t" o:connecttype="custom" o:connectlocs="134661,685922;361138,598499;516082,999895;671025,598499;897502,685922;646193,1336964;897502,1988005;671025,2075428;516082,1674032;361138,2075428;134661,1988005;385970,1336964;134661,685922" o:connectangles="0,0,0,0,0,0,0,0,0,0,0,0,0"/>
+              </v:shape>
+            </w:pict>
+          </mc:Fallback>
+        </mc:AlternateContent>
+      </w:r>
       <w:r>
         <w:drawing>
           <wp:inline distT="0" distB="0" distL="0" distR="0" wp14:anchorId="513BF848" wp14:editId="6215AB04">

</xml_diff>